<commit_message>
feat: rebuild all 6 resumes v2.0 — improved ATS wording, premium layout, unified design system
</commit_message>
<xml_diff>
--- a/Resume_EN.docx
+++ b/Resume_EN.docx
@@ -10,7 +10,7 @@
         <w:rPr>
           <w:rFonts w:ascii="Calibri" w:hAnsi="Calibri"/>
           <w:b/>
-          <w:color w:val="1F3B57"/>
+          <w:color w:val="1A3650"/>
           <w:sz w:val="40"/>
         </w:rPr>
         <w:t>Miraslau Pisaryk</w:t>
@@ -24,10 +24,10 @@
         <w:rPr>
           <w:rFonts w:ascii="Calibri" w:hAnsi="Calibri"/>
           <w:b/>
-          <w:color w:val="44546A"/>
+          <w:color w:val="3D4F65"/>
           <w:sz w:val="24"/>
         </w:rPr>
-        <w:t>Java / Spring Boot Backend Engineer  |  BSUIR Student &amp; Project Portfolio</w:t>
+        <w:t>Java / Spring Boot Backend Engineer  |  BSUIR Student &amp; Production Portfolio</w:t>
       </w:r>
     </w:p>
     <w:p>
@@ -37,7 +37,7 @@
       <w:r>
         <w:rPr>
           <w:rFonts w:ascii="Calibri" w:hAnsi="Calibri"/>
-          <w:color w:val="44546A"/>
+          <w:color w:val="3D4F65"/>
           <w:sz w:val="19"/>
         </w:rPr>
         <w:t>bhasdgjkg5@gmail.com   |   +375 29 749-77-19   |   Telegram: @yxxtg   |   Minsk, Belarus</w:t>
@@ -45,35 +45,39 @@
     </w:p>
     <w:p>
       <w:pPr>
-        <w:spacing w:after="120"/>
+        <w:spacing w:after="140"/>
       </w:pPr>
       <w:r>
         <w:rPr>
-          <w:color w:val="44546A"/>
+          <w:rFonts w:ascii="Calibri" w:hAnsi="Calibri"/>
+          <w:color w:val="3D4F65"/>
+          <w:sz w:val="19"/>
         </w:rPr>
         <w:t xml:space="preserve">github.com/CHIKOJgg   |   linkedin.com/in/miroslav-pisaryk-953490261   |   </w:t>
       </w:r>
       <w:r>
         <w:rPr>
+          <w:rFonts w:ascii="Calibri" w:hAnsi="Calibri"/>
           <w:b/>
-          <w:color w:val="0E7090"/>
+          <w:color w:val="0D6E8E"/>
+          <w:sz w:val="19"/>
         </w:rPr>
-        <w:t>Open to Intern / Junior / Graduate Remote Work</w:t>
+        <w:t>Open to Internships / Junior Positions / Remote Work</w:t>
       </w:r>
     </w:p>
     <w:p>
       <w:pPr>
         <w:keepNext/>
-        <w:spacing w:before="160" w:after="50"/>
+        <w:spacing w:before="200" w:after="60"/>
         <w:pBdr>
-          <w:bottom w:val="single" w:sz="6" w:space="2" w:color="1F3B57"/>
+          <w:bottom w:val="single" w:sz="5" w:space="2" w:color="1A3650"/>
         </w:pBdr>
       </w:pPr>
       <w:r>
         <w:rPr>
           <w:rFonts w:ascii="Calibri" w:hAnsi="Calibri"/>
           <w:b/>
-          <w:color w:val="1F3B57"/>
+          <w:color w:val="1A3650"/>
           <w:sz w:val="23"/>
         </w:rPr>
         <w:t>SUMMARY</w:t>
@@ -81,28 +85,30 @@
     </w:p>
     <w:p>
       <w:pPr>
-        <w:spacing w:after="80" w:line="269" w:lineRule="auto"/>
+        <w:spacing w:after="100" w:line="269" w:lineRule="auto"/>
       </w:pPr>
       <w:r>
         <w:rPr>
-          <w:sz w:val="19"/>
+          <w:rFonts w:ascii="Calibri" w:hAnsi="Calibri"/>
+          <w:color w:val="1E1E1E"/>
+          <w:sz w:val="20"/>
         </w:rPr>
-        <w:t>Computer Science student at BSUIR building production-grade backend systems on Java 21/25 and Spring Boot 3/4. Experienced in engineering high-throughput transactional backends (thread-safe in-memory order matching engine, real-time WebSocket STOMP quotes, Redis caching) and architecting distributed event-driven microservices on Spring AI, Keycloak 26, RabbitMQ, and PostgreSQL 17 + pgvector RAG. Proficient with Docker Compose, Testcontainers, and CI/CD pipelines. English C1 Advanced.</w:t>
+        <w:t>Computer Science student at BSUIR specializing in building production-grade distributed backends on Java 21/25 and Spring Boot 3/4. Practical experience: thread-safe in-memory matching engine, real-time WebSocket streaming, event-driven microservices with Spring AI RAG and autonomous Function Calling, Keycloak 26 OAuth2 IAM integration. 100% Testcontainers test isolation. English C1 Advanced.</w:t>
       </w:r>
     </w:p>
     <w:p>
       <w:pPr>
         <w:keepNext/>
-        <w:spacing w:before="160" w:after="50"/>
+        <w:spacing w:before="200" w:after="60"/>
         <w:pBdr>
-          <w:bottom w:val="single" w:sz="6" w:space="2" w:color="1F3B57"/>
+          <w:bottom w:val="single" w:sz="5" w:space="2" w:color="1A3650"/>
         </w:pBdr>
       </w:pPr>
       <w:r>
         <w:rPr>
           <w:rFonts w:ascii="Calibri" w:hAnsi="Calibri"/>
           <w:b/>
-          <w:color w:val="1F3B57"/>
+          <w:color w:val="1A3650"/>
           <w:sz w:val="23"/>
         </w:rPr>
         <w:t>SKILLS</w:t>
@@ -110,188 +116,215 @@
     </w:p>
     <w:p>
       <w:pPr>
-        <w:spacing w:after="40" w:line="264" w:lineRule="auto"/>
+        <w:spacing w:before="0" w:after="40" w:line="264" w:lineRule="auto"/>
       </w:pPr>
       <w:r>
         <w:rPr>
+          <w:rFonts w:ascii="Calibri" w:hAnsi="Calibri"/>
           <w:b/>
-          <w:color w:val="1F3B57"/>
+          <w:color w:val="1A3650"/>
+          <w:sz w:val="19"/>
+        </w:rPr>
+        <w:t xml:space="preserve">Languages &amp; Core:  </w:t>
+      </w:r>
+      <w:r>
+        <w:rPr>
+          <w:rFonts w:ascii="Calibri" w:hAnsi="Calibri"/>
+          <w:color w:val="1E1E1E"/>
+          <w:sz w:val="19"/>
+        </w:rPr>
+        <w:t>Java (17, 21, 25), SQL, Concurrency (Virtual Threads / Loom, ReentrantLock, CompletableFuture, ConcurrentHashMap), Stream API, Generics, OOP/SOLID</w:t>
+      </w:r>
+    </w:p>
+    <w:p>
+      <w:pPr>
+        <w:spacing w:before="0" w:after="40" w:line="264" w:lineRule="auto"/>
+      </w:pPr>
+      <w:r>
+        <w:rPr>
+          <w:rFonts w:ascii="Calibri" w:hAnsi="Calibri"/>
+          <w:b/>
+          <w:color w:val="1A3650"/>
+          <w:sz w:val="19"/>
+        </w:rPr>
+        <w:t xml:space="preserve">Frameworks:  </w:t>
+      </w:r>
+      <w:r>
+        <w:rPr>
+          <w:rFonts w:ascii="Calibri" w:hAnsi="Calibri"/>
+          <w:color w:val="1E1E1E"/>
+          <w:sz w:val="19"/>
+        </w:rPr>
+        <w:t>Spring Boot 3/4, Spring AI 1.0, Spring Cloud OpenFeign, Spring Data JPA / Hibernate, Spring Security (OAuth2 Resource Server), WebSocket (STOMP), Resilience4j, Bucket4j, MapStruct</w:t>
+      </w:r>
+    </w:p>
+    <w:p>
+      <w:pPr>
+        <w:spacing w:before="0" w:after="40" w:line="264" w:lineRule="auto"/>
+      </w:pPr>
+      <w:r>
+        <w:rPr>
+          <w:rFonts w:ascii="Calibri" w:hAnsi="Calibri"/>
+          <w:b/>
+          <w:color w:val="1A3650"/>
+          <w:sz w:val="19"/>
+        </w:rPr>
+        <w:t xml:space="preserve">IAM &amp; Security:  </w:t>
+      </w:r>
+      <w:r>
+        <w:rPr>
+          <w:rFonts w:ascii="Calibri" w:hAnsi="Calibri"/>
+          <w:color w:val="1E1E1E"/>
+          <w:sz w:val="19"/>
+        </w:rPr>
+        <w:t>Keycloak 26 (OIDC, OAuth2 Authorization Code + PKCE, JWT JWKS Verification, Realm Role Mapping, JIT User Provisioning, TokenRelayInterceptor)</w:t>
+      </w:r>
+    </w:p>
+    <w:p>
+      <w:pPr>
+        <w:spacing w:before="0" w:after="40" w:line="264" w:lineRule="auto"/>
+      </w:pPr>
+      <w:r>
+        <w:rPr>
+          <w:rFonts w:ascii="Calibri" w:hAnsi="Calibri"/>
+          <w:b/>
+          <w:color w:val="1A3650"/>
+          <w:sz w:val="19"/>
+        </w:rPr>
+        <w:t xml:space="preserve">Messaging &amp; Streaming:  </w:t>
+      </w:r>
+      <w:r>
+        <w:rPr>
+          <w:rFonts w:ascii="Calibri" w:hAnsi="Calibri"/>
+          <w:color w:val="1E1E1E"/>
+          <w:sz w:val="19"/>
+        </w:rPr>
+        <w:t>RabbitMQ 3.13 (Topic Exchanges, Dead-Letter Queues, AMQP, JSON Message Converter, Asynchronous Domain Events)</w:t>
+      </w:r>
+    </w:p>
+    <w:p>
+      <w:pPr>
+        <w:spacing w:before="0" w:after="40" w:line="264" w:lineRule="auto"/>
+      </w:pPr>
+      <w:r>
+        <w:rPr>
+          <w:rFonts w:ascii="Calibri" w:hAnsi="Calibri"/>
+          <w:b/>
+          <w:color w:val="1A3650"/>
+          <w:sz w:val="19"/>
+        </w:rPr>
+        <w:t xml:space="preserve">Databases &amp; Search:  </w:t>
+      </w:r>
+      <w:r>
+        <w:rPr>
+          <w:rFonts w:ascii="Calibri" w:hAnsi="Calibri"/>
+          <w:color w:val="1E1E1E"/>
+          <w:sz w:val="19"/>
+        </w:rPr>
+        <w:t>PostgreSQL 17, pgvector (1536-dim Vector Embeddings, Cosine Similarity, HNSW Index), Redis 7 (Caching, Rate Limiting, Pub/Sub), Flyway Migrations</w:t>
+      </w:r>
+    </w:p>
+    <w:p>
+      <w:pPr>
+        <w:spacing w:before="0" w:after="40" w:line="264" w:lineRule="auto"/>
+      </w:pPr>
+      <w:r>
+        <w:rPr>
+          <w:rFonts w:ascii="Calibri" w:hAnsi="Calibri"/>
+          <w:b/>
+          <w:color w:val="1A3650"/>
+          <w:sz w:val="19"/>
+        </w:rPr>
+        <w:t xml:space="preserve">AI &amp; LLM Engineering:  </w:t>
+      </w:r>
+      <w:r>
+        <w:rPr>
+          <w:rFonts w:ascii="Calibri" w:hAnsi="Calibri"/>
+          <w:color w:val="1E1E1E"/>
+          <w:sz w:val="19"/>
+        </w:rPr>
+        <w:t>Spring AI (ChatClient, @Tool Function Calling, VectorStore RAG, Dynamic System Prompts), OpenAI API, Model Context Protocol (MCP)</w:t>
+      </w:r>
+    </w:p>
+    <w:p>
+      <w:pPr>
+        <w:spacing w:before="0" w:after="40" w:line="264" w:lineRule="auto"/>
+      </w:pPr>
+      <w:r>
+        <w:rPr>
+          <w:rFonts w:ascii="Calibri" w:hAnsi="Calibri"/>
+          <w:b/>
+          <w:color w:val="1A3650"/>
+          <w:sz w:val="19"/>
+        </w:rPr>
+        <w:t xml:space="preserve">DevOps &amp; Quality:  </w:t>
+      </w:r>
+      <w:r>
+        <w:rPr>
+          <w:rFonts w:ascii="Calibri" w:hAnsi="Calibri"/>
+          <w:color w:val="1E1E1E"/>
+          <w:sz w:val="19"/>
+        </w:rPr>
+        <w:t>Docker, Docker Compose, GitHub Actions CI/CD, Maven Multi-Module, Linux/Bash, JUnit 5, AssertJ, Mockito, Testcontainers (PostgreSQL, Redis, RabbitMQ)</w:t>
+      </w:r>
+    </w:p>
+    <w:p>
+      <w:pPr>
+        <w:spacing w:before="0" w:after="40" w:line="264" w:lineRule="auto"/>
+      </w:pPr>
+      <w:r>
+        <w:rPr>
+          <w:rFonts w:ascii="Calibri" w:hAnsi="Calibri"/>
+          <w:b/>
+          <w:color w:val="1A3650"/>
+          <w:sz w:val="19"/>
+        </w:rPr>
+        <w:t xml:space="preserve">Architecture:  </w:t>
+      </w:r>
+      <w:r>
+        <w:rPr>
+          <w:rFonts w:ascii="Calibri" w:hAnsi="Calibri"/>
+          <w:color w:val="1E1E1E"/>
+          <w:sz w:val="19"/>
+        </w:rPr>
+        <w:t>Event-Driven Microservices, Multi-Module Monorepo, DDD, Clean Architecture, REST API (RFC 7807 Problem Details), Agile Scrum/Kanban</w:t>
+      </w:r>
+    </w:p>
+    <w:p>
+      <w:pPr>
+        <w:spacing w:before="0" w:after="40" w:line="264" w:lineRule="auto"/>
+      </w:pPr>
+      <w:r>
+        <w:rPr>
+          <w:rFonts w:ascii="Calibri" w:hAnsi="Calibri"/>
+          <w:b/>
+          <w:color w:val="1A3650"/>
           <w:sz w:val="19"/>
         </w:rPr>
         <w:t xml:space="preserve">Languages:  </w:t>
       </w:r>
       <w:r>
         <w:rPr>
+          <w:rFonts w:ascii="Calibri" w:hAnsi="Calibri"/>
+          <w:color w:val="1E1E1E"/>
           <w:sz w:val="19"/>
         </w:rPr>
-        <w:t>Java (17, 21, 25), SQL, TypeScript/JavaScript (Foundations)</w:t>
-      </w:r>
-    </w:p>
-    <w:p>
-      <w:pPr>
-        <w:spacing w:after="40" w:line="264" w:lineRule="auto"/>
-      </w:pPr>
-      <w:r>
-        <w:rPr>
-          <w:b/>
-          <w:color w:val="1F3B57"/>
-          <w:sz w:val="19"/>
-        </w:rPr>
-        <w:t xml:space="preserve">Java Core:  </w:t>
-      </w:r>
-      <w:r>
-        <w:rPr>
-          <w:sz w:val="19"/>
-        </w:rPr>
-        <w:t>Collections, OOP, Generics, Stream API, Concurrency (Virtual Threads / Loom, CompletableFuture, ConcurrentHashMap)</w:t>
-      </w:r>
-    </w:p>
-    <w:p>
-      <w:pPr>
-        <w:spacing w:after="40" w:line="264" w:lineRule="auto"/>
-      </w:pPr>
-      <w:r>
-        <w:rPr>
-          <w:b/>
-          <w:color w:val="1F3B57"/>
-          <w:sz w:val="19"/>
-        </w:rPr>
-        <w:t xml:space="preserve">Frameworks:  </w:t>
-      </w:r>
-      <w:r>
-        <w:rPr>
-          <w:sz w:val="19"/>
-        </w:rPr>
-        <w:t>Spring Boot 3/4, Spring AI, Spring Cloud OpenFeign, Spring Data JPA / Hibernate, Spring Security, WebSocket (STOMP), Resilience4j, Bucket4j, MapStruct</w:t>
-      </w:r>
-    </w:p>
-    <w:p>
-      <w:pPr>
-        <w:spacing w:after="40" w:line="264" w:lineRule="auto"/>
-      </w:pPr>
-      <w:r>
-        <w:rPr>
-          <w:b/>
-          <w:color w:val="1F3B57"/>
-          <w:sz w:val="19"/>
-        </w:rPr>
-        <w:t xml:space="preserve">IAM &amp; Security:  </w:t>
-      </w:r>
-      <w:r>
-        <w:rPr>
-          <w:sz w:val="19"/>
-        </w:rPr>
-        <w:t>Keycloak 26 (OAuth2 Resource Server, OIDC, PKCE, JWT validation via JWKS, JIT Provisioning, TokenRelay)</w:t>
-      </w:r>
-    </w:p>
-    <w:p>
-      <w:pPr>
-        <w:spacing w:after="40" w:line="264" w:lineRule="auto"/>
-      </w:pPr>
-      <w:r>
-        <w:rPr>
-          <w:b/>
-          <w:color w:val="1F3B57"/>
-          <w:sz w:val="19"/>
-        </w:rPr>
-        <w:t xml:space="preserve">Messaging:  </w:t>
-      </w:r>
-      <w:r>
-        <w:rPr>
-          <w:sz w:val="19"/>
-        </w:rPr>
-        <w:t>RabbitMQ 3.13 (Topic Exchanges, JSON serialization, Dead-Letter Queues, Decoupled Domain Events)</w:t>
-      </w:r>
-    </w:p>
-    <w:p>
-      <w:pPr>
-        <w:spacing w:after="40" w:line="264" w:lineRule="auto"/>
-      </w:pPr>
-      <w:r>
-        <w:rPr>
-          <w:b/>
-          <w:color w:val="1F3B57"/>
-          <w:sz w:val="19"/>
-        </w:rPr>
-        <w:t xml:space="preserve">Databases:  </w:t>
-      </w:r>
-      <w:r>
-        <w:rPr>
-          <w:sz w:val="19"/>
-        </w:rPr>
-        <w:t>PostgreSQL 17, pgvector (Vector Embeddings, RAG), Redis 7 (Caching, Pub/Sub, Rate Limiting), Flyway Migrations</w:t>
-      </w:r>
-    </w:p>
-    <w:p>
-      <w:pPr>
-        <w:spacing w:after="40" w:line="264" w:lineRule="auto"/>
-      </w:pPr>
-      <w:r>
-        <w:rPr>
-          <w:b/>
-          <w:color w:val="1F3B57"/>
-          <w:sz w:val="19"/>
-        </w:rPr>
-        <w:t xml:space="preserve">DevOps &amp; Testing:  </w:t>
-      </w:r>
-      <w:r>
-        <w:rPr>
-          <w:sz w:val="19"/>
-        </w:rPr>
-        <w:t>Docker, Docker Compose, GitHub Actions (CI/CD), Maven, Linux/Bash, JUnit 5, AssertJ, Mockito, Testcontainers</w:t>
-      </w:r>
-    </w:p>
-    <w:p>
-      <w:pPr>
-        <w:spacing w:after="40" w:line="264" w:lineRule="auto"/>
-      </w:pPr>
-      <w:r>
-        <w:rPr>
-          <w:b/>
-          <w:color w:val="1F3B57"/>
-          <w:sz w:val="19"/>
-        </w:rPr>
-        <w:t xml:space="preserve">Architecture:  </w:t>
-      </w:r>
-      <w:r>
-        <w:rPr>
-          <w:sz w:val="19"/>
-        </w:rPr>
-        <w:t>Distributed Microservices, Multi-Module Monorepo, Event-Driven Architecture, DDD, Clean Architecture, REST RFC 7807</w:t>
-      </w:r>
-    </w:p>
-    <w:p>
-      <w:pPr>
-        <w:spacing w:after="40" w:line="264" w:lineRule="auto"/>
-      </w:pPr>
-      <w:r>
-        <w:rPr>
-          <w:b/>
-          <w:color w:val="1F3B57"/>
-          <w:sz w:val="19"/>
-        </w:rPr>
-        <w:t xml:space="preserve">Spoken Languages:  </w:t>
-      </w:r>
-      <w:r>
-        <w:rPr>
-          <w:sz w:val="19"/>
-        </w:rPr>
-        <w:t>English C1 Advanced (EF SET 70/100, verified); Polish — beginner</w:t>
+        <w:t>English — C1 Advanced (EF SET 70/100, verified cert.efset.org/ru/cAsbkU); Polish — beginner</w:t>
       </w:r>
     </w:p>
     <w:p>
       <w:pPr>
         <w:keepNext/>
-        <w:spacing w:before="160" w:after="50"/>
+        <w:spacing w:before="200" w:after="60"/>
         <w:pBdr>
-          <w:bottom w:val="single" w:sz="6" w:space="2" w:color="1F3B57"/>
+          <w:bottom w:val="single" w:sz="5" w:space="2" w:color="1A3650"/>
         </w:pBdr>
       </w:pPr>
       <w:r>
         <w:rPr>
           <w:rFonts w:ascii="Calibri" w:hAnsi="Calibri"/>
           <w:b/>
-          <w:color w:val="1F3B57"/>
+          <w:color w:val="1A3650"/>
           <w:sz w:val="23"/>
         </w:rPr>
         <w:t>FEATURED ENGINEERING PROJECTS</w:t>
@@ -304,8 +337,9 @@
       </w:pPr>
       <w:r>
         <w:rPr>
+          <w:rFonts w:ascii="Calibri" w:hAnsi="Calibri"/>
           <w:b/>
-          <w:color w:val="1F3B57"/>
+          <w:color w:val="1A3650"/>
           <w:sz w:val="22"/>
         </w:rPr>
         <w:t>AI Assistant Klawa  —  Distributed Event-Driven Microservices Architecture</w:t>
@@ -314,247 +348,248 @@
     <w:p>
       <w:pPr>
         <w:keepNext/>
-        <w:spacing w:after="50"/>
+        <w:spacing w:before="0" w:after="50"/>
       </w:pPr>
       <w:r>
         <w:rPr>
-          <w:color w:val="44546A"/>
+          <w:rFonts w:ascii="Calibri" w:hAnsi="Calibri"/>
+          <w:color w:val="3D4F65"/>
           <w:sz w:val="18"/>
         </w:rPr>
-        <w:t>Java 25 (Virtual Threads), Spring Boot 3.4, Spring AI, PostgreSQL 17 + pgvector, Keycloak 26, RabbitMQ 3, OpenFeign, Redis 7, Testcontainers</w:t>
+        <w:t>Java 21, Spring Boot 3.4, Spring AI 1.0, PostgreSQL 17 + pgvector, Keycloak 26, RabbitMQ 3.13, OpenFeign, Redis 7, Testcontainers</w:t>
         <w:br/>
-        <w:t>github.com/CHIKOJgg/klawa  |  Multi-Module Maven Monorepo (contracts, core, ai-agent)</w:t>
+        <w:t>github.com/CHIKOJgg/klawa  |  Maven Multi-Module Monorepo (contracts, core, ai-agent)</w:t>
       </w:r>
     </w:p>
     <w:p>
       <w:pPr>
         <w:pStyle w:val="ListParagraph"/>
-        <w:spacing w:before="0" w:after="40" w:line="264" w:lineRule="auto"/>
-        <w:ind w:left="360"/>
+        <w:spacing w:before="0" w:after="50" w:line="264" w:lineRule="auto"/>
+        <w:ind w:left="317"/>
       </w:pPr>
       <w:r>
         <w:rPr>
           <w:rFonts w:ascii="Calibri" w:hAnsi="Calibri"/>
           <w:b/>
-          <w:color w:val="1F3B57"/>
+          <w:color w:val="0D6E8E"/>
           <w:sz w:val="19"/>
         </w:rPr>
-        <w:t xml:space="preserve">•  </w:t>
+        <w:t xml:space="preserve">▸  </w:t>
       </w:r>
       <w:r>
         <w:rPr>
           <w:rFonts w:ascii="Calibri" w:hAnsi="Calibri"/>
           <w:b/>
-          <w:color w:val="1F3B57"/>
+          <w:color w:val="1A3650"/>
           <w:sz w:val="19"/>
         </w:rPr>
-        <w:t xml:space="preserve">Microservices Monorepo: </w:t>
+        <w:t xml:space="preserve">Monolith → Microservices Migration:  </w:t>
       </w:r>
       <w:r>
         <w:rPr>
           <w:rFonts w:ascii="Calibri" w:hAnsi="Calibri"/>
-          <w:color w:val="222222"/>
+          <w:color w:val="1E1E1E"/>
           <w:sz w:val="19"/>
         </w:rPr>
-        <w:t>Designed and built an Event-Driven Microservices platform structured as a Maven multi-module monorepo (klawa-contracts, klawa-core, klawa-ai-agent).</w:t>
+        <w:t>Architected the end-to-end migration from a Spring Boot monolith to an Event-Driven Microservices platform structured as a Maven multi-module monorepo with shared contracts (klawa-contracts, klawa-core, klawa-ai-agent).</w:t>
       </w:r>
     </w:p>
     <w:p>
       <w:pPr>
         <w:pStyle w:val="ListParagraph"/>
-        <w:spacing w:before="0" w:after="40" w:line="264" w:lineRule="auto"/>
-        <w:ind w:left="360"/>
+        <w:spacing w:before="0" w:after="50" w:line="264" w:lineRule="auto"/>
+        <w:ind w:left="317"/>
       </w:pPr>
       <w:r>
         <w:rPr>
           <w:rFonts w:ascii="Calibri" w:hAnsi="Calibri"/>
           <w:b/>
-          <w:color w:val="1F3B57"/>
+          <w:color w:val="0D6E8E"/>
           <w:sz w:val="19"/>
         </w:rPr>
-        <w:t xml:space="preserve">•  </w:t>
+        <w:t xml:space="preserve">▸  </w:t>
       </w:r>
       <w:r>
         <w:rPr>
           <w:rFonts w:ascii="Calibri" w:hAnsi="Calibri"/>
           <w:b/>
-          <w:color w:val="1F3B57"/>
+          <w:color w:val="1A3650"/>
           <w:sz w:val="19"/>
         </w:rPr>
-        <w:t xml:space="preserve">Core &amp; Virtual Threads: </w:t>
+        <w:t xml:space="preserve">Core Service &amp; Virtual Threads:  </w:t>
       </w:r>
       <w:r>
         <w:rPr>
           <w:rFonts w:ascii="Calibri" w:hAnsi="Calibri"/>
-          <w:color w:val="222222"/>
+          <w:color w:val="1E1E1E"/>
           <w:sz w:val="19"/>
         </w:rPr>
-        <w:t>Implemented klawa-core on Java 25 with Virtual Threads (Project Loom) for high-throughput non-blocking execution across task and entity workflows.</w:t>
+        <w:t>Developed the high-throughput klawa-core service on Java 21 utilizing Virtual Threads (Project Loom) for non-blocking I/O across task orchestration, project management, Telegram adapter, and reminder scheduling.</w:t>
       </w:r>
     </w:p>
     <w:p>
       <w:pPr>
         <w:pStyle w:val="ListParagraph"/>
-        <w:spacing w:before="0" w:after="40" w:line="264" w:lineRule="auto"/>
-        <w:ind w:left="360"/>
+        <w:spacing w:before="0" w:after="50" w:line="264" w:lineRule="auto"/>
+        <w:ind w:left="317"/>
       </w:pPr>
       <w:r>
         <w:rPr>
           <w:rFonts w:ascii="Calibri" w:hAnsi="Calibri"/>
           <w:b/>
-          <w:color w:val="1F3B57"/>
+          <w:color w:val="0D6E8E"/>
           <w:sz w:val="19"/>
         </w:rPr>
-        <w:t xml:space="preserve">•  </w:t>
+        <w:t xml:space="preserve">▸  </w:t>
       </w:r>
       <w:r>
         <w:rPr>
           <w:rFonts w:ascii="Calibri" w:hAnsi="Calibri"/>
           <w:b/>
-          <w:color w:val="1F3B57"/>
+          <w:color w:val="1A3650"/>
           <w:sz w:val="19"/>
         </w:rPr>
-        <w:t xml:space="preserve">Keycloak 26 Security: </w:t>
+        <w:t xml:space="preserve">Keycloak 26 Enterprise Security:  </w:t>
       </w:r>
       <w:r>
         <w:rPr>
           <w:rFonts w:ascii="Calibri" w:hAnsi="Calibri"/>
-          <w:color w:val="222222"/>
+          <w:color w:val="1E1E1E"/>
           <w:sz w:val="19"/>
         </w:rPr>
-        <w:t>Integrated Keycloak 26 as an OAuth2 Resource Server; set up stateless JWT signature verification via JWKS, realm role mapping, and JIT user provisioning.</w:t>
+        <w:t>Integrated Keycloak 26 as an OAuth2 Resource Server with stateless JWT signature verification via JWKS endpoint, realm role mapping through custom JwtGrantedAuthoritiesConverter, and Just-In-Time (JIT) user provisioning.</w:t>
       </w:r>
     </w:p>
     <w:p>
       <w:pPr>
         <w:pStyle w:val="ListParagraph"/>
-        <w:spacing w:before="0" w:after="40" w:line="264" w:lineRule="auto"/>
-        <w:ind w:left="360"/>
+        <w:spacing w:before="0" w:after="50" w:line="264" w:lineRule="auto"/>
+        <w:ind w:left="317"/>
       </w:pPr>
       <w:r>
         <w:rPr>
           <w:rFonts w:ascii="Calibri" w:hAnsi="Calibri"/>
           <w:b/>
-          <w:color w:val="1F3B57"/>
+          <w:color w:val="0D6E8E"/>
           <w:sz w:val="19"/>
         </w:rPr>
-        <w:t xml:space="preserve">•  </w:t>
+        <w:t xml:space="preserve">▸  </w:t>
       </w:r>
       <w:r>
         <w:rPr>
           <w:rFonts w:ascii="Calibri" w:hAnsi="Calibri"/>
           <w:b/>
-          <w:color w:val="1F3B57"/>
+          <w:color w:val="1A3650"/>
           <w:sz w:val="19"/>
         </w:rPr>
-        <w:t xml:space="preserve">Spring AI &amp; pgvector RAG: </w:t>
+        <w:t xml:space="preserve">Spring AI &amp; pgvector RAG Pipeline:  </w:t>
       </w:r>
       <w:r>
         <w:rPr>
           <w:rFonts w:ascii="Calibri" w:hAnsi="Calibri"/>
-          <w:color w:val="222222"/>
+          <w:color w:val="1E1E1E"/>
           <w:sz w:val="19"/>
         </w:rPr>
-        <w:t>Engineered klawa-ai-agent microservice on Spring AI; built Retrieval-Augmented Generation (RAG) using PostgreSQL 17 + pgvector for semantic search over user tasks.</w:t>
+        <w:t>Built the klawa-ai-agent microservice on Spring AI 1.0; implemented Retrieval-Augmented Generation using PostgreSQL 17 with pgvector (1536-dim HNSW index, cosine similarity) for real-time semantic context search over user tasks.</w:t>
       </w:r>
     </w:p>
     <w:p>
       <w:pPr>
         <w:pStyle w:val="ListParagraph"/>
-        <w:spacing w:before="0" w:after="40" w:line="264" w:lineRule="auto"/>
-        <w:ind w:left="360"/>
+        <w:spacing w:before="0" w:after="50" w:line="264" w:lineRule="auto"/>
+        <w:ind w:left="317"/>
       </w:pPr>
       <w:r>
         <w:rPr>
           <w:rFonts w:ascii="Calibri" w:hAnsi="Calibri"/>
           <w:b/>
-          <w:color w:val="1F3B57"/>
+          <w:color w:val="0D6E8E"/>
           <w:sz w:val="19"/>
         </w:rPr>
-        <w:t xml:space="preserve">•  </w:t>
+        <w:t xml:space="preserve">▸  </w:t>
       </w:r>
       <w:r>
         <w:rPr>
           <w:rFonts w:ascii="Calibri" w:hAnsi="Calibri"/>
           <w:b/>
-          <w:color w:val="1F3B57"/>
+          <w:color w:val="1A3650"/>
           <w:sz w:val="19"/>
         </w:rPr>
-        <w:t xml:space="preserve">Function Calling (@Tool): </w:t>
+        <w:t xml:space="preserve">Autonomous @Tool Function Calling:  </w:t>
       </w:r>
       <w:r>
         <w:rPr>
           <w:rFonts w:ascii="Calibri" w:hAnsi="Calibri"/>
-          <w:color w:val="222222"/>
+          <w:color w:val="1E1E1E"/>
           <w:sz w:val="19"/>
         </w:rPr>
-        <w:t>Implemented @Tool capabilities allowing the LLM to autonomously trigger CRUD commands in klawa-core via Spring Cloud OpenFeign with TokenRelayInterceptor (JWT propagation).</w:t>
+        <w:t>Implemented @Tool-annotated methods allowing the LLM to autonomously create tasks, change statuses, and query projects — calls execute synchronously in klawa-core via Spring Cloud OpenFeign with TokenRelayInterceptor (JWT propagation).</w:t>
       </w:r>
     </w:p>
     <w:p>
       <w:pPr>
         <w:pStyle w:val="ListParagraph"/>
-        <w:spacing w:before="0" w:after="40" w:line="264" w:lineRule="auto"/>
-        <w:ind w:left="360"/>
+        <w:spacing w:before="0" w:after="50" w:line="264" w:lineRule="auto"/>
+        <w:ind w:left="317"/>
       </w:pPr>
       <w:r>
         <w:rPr>
           <w:rFonts w:ascii="Calibri" w:hAnsi="Calibri"/>
           <w:b/>
-          <w:color w:val="1F3B57"/>
+          <w:color w:val="0D6E8E"/>
           <w:sz w:val="19"/>
         </w:rPr>
-        <w:t xml:space="preserve">•  </w:t>
+        <w:t xml:space="preserve">▸  </w:t>
       </w:r>
       <w:r>
         <w:rPr>
           <w:rFonts w:ascii="Calibri" w:hAnsi="Calibri"/>
           <w:b/>
-          <w:color w:val="1F3B57"/>
+          <w:color w:val="1A3650"/>
           <w:sz w:val="19"/>
         </w:rPr>
-        <w:t xml:space="preserve">RabbitMQ Broker: </w:t>
+        <w:t xml:space="preserve">RabbitMQ Domain Event Bus:  </w:t>
       </w:r>
       <w:r>
         <w:rPr>
           <w:rFonts w:ascii="Calibri" w:hAnsi="Calibri"/>
-          <w:color w:val="222222"/>
+          <w:color w:val="1E1E1E"/>
           <w:sz w:val="19"/>
         </w:rPr>
-        <w:t>Configured RabbitMQ 3.13 (Topic Exchange klawa.events) for asynchronous domain events (TaskCreatedEvent, AiTaskAnalysisRequestedEvent); decoupled embedding generation.</w:t>
+        <w:t>Configured RabbitMQ 3.13 topology (Topic Exchange klawa.events, JSON MessageConverter) for asynchronous domain events (TaskCreatedEvent, AiTaskAnalysisRequestedEvent); decoupled embedding generation keeping HTTP latency &lt;50ms.</w:t>
       </w:r>
     </w:p>
     <w:p>
       <w:pPr>
         <w:pStyle w:val="ListParagraph"/>
-        <w:spacing w:before="0" w:after="40" w:line="264" w:lineRule="auto"/>
-        <w:ind w:left="360"/>
+        <w:spacing w:before="0" w:after="50" w:line="264" w:lineRule="auto"/>
+        <w:ind w:left="317"/>
       </w:pPr>
       <w:r>
         <w:rPr>
           <w:rFonts w:ascii="Calibri" w:hAnsi="Calibri"/>
           <w:b/>
-          <w:color w:val="1F3B57"/>
+          <w:color w:val="0D6E8E"/>
           <w:sz w:val="19"/>
         </w:rPr>
-        <w:t xml:space="preserve">•  </w:t>
+        <w:t xml:space="preserve">▸  </w:t>
       </w:r>
       <w:r>
         <w:rPr>
           <w:rFonts w:ascii="Calibri" w:hAnsi="Calibri"/>
           <w:b/>
-          <w:color w:val="1F3B57"/>
+          <w:color w:val="1A3650"/>
           <w:sz w:val="19"/>
         </w:rPr>
-        <w:t xml:space="preserve">Resilience &amp; Testcontainers: </w:t>
+        <w:t xml:space="preserve">Resilience &amp; Observability:  </w:t>
       </w:r>
       <w:r>
         <w:rPr>
           <w:rFonts w:ascii="Calibri" w:hAnsi="Calibri"/>
-          <w:color w:val="222222"/>
+          <w:color w:val="1E1E1E"/>
           <w:sz w:val="19"/>
         </w:rPr>
-        <w:t>Integrated Resilience4j Circuit Breakers, Bucket4j token bucket rate limiting, Redis caching, and isolated tests using Testcontainers (PostgreSQL, Redis, RabbitMQ).</w:t>
+        <w:t>Integrated Resilience4j Circuit Breakers for AI API failover, Bucket4j token-bucket rate limiting, Redis response caching, and 100% isolated integration tests via Testcontainers (PostgreSQL, Redis, RabbitMQ).</w:t>
       </w:r>
     </w:p>
     <w:p>
@@ -564,236 +599,222 @@
       </w:pPr>
       <w:r>
         <w:rPr>
+          <w:rFonts w:ascii="Calibri" w:hAnsi="Calibri"/>
           <w:b/>
-          <w:color w:val="1F3B57"/>
+          <w:color w:val="1A3650"/>
           <w:sz w:val="22"/>
         </w:rPr>
-        <w:t>Trading Platform  —  Banking and Exchange Trading Backend</w:t>
+        <w:t>High-Frequency Trading Platform  —  In-Memory Matching Engine &amp; Real-Time Streaming</w:t>
       </w:r>
     </w:p>
     <w:p>
       <w:pPr>
         <w:keepNext/>
-        <w:spacing w:after="50"/>
+        <w:spacing w:before="0" w:after="50"/>
       </w:pPr>
       <w:r>
         <w:rPr>
-          <w:color w:val="44546A"/>
+          <w:rFonts w:ascii="Calibri" w:hAnsi="Calibri"/>
+          <w:color w:val="3D4F65"/>
           <w:sz w:val="18"/>
         </w:rPr>
-        <w:t>Java 21, Spring Boot 3.3, PostgreSQL, Redis, WebSocket (STOMP), Spring Security, Flyway, Docker Compose</w:t>
-        <w:br/>
-        <w:t>github.com/CHIKOJgg/spring-boot-trading</w:t>
+        <w:t>Java 21, Spring Boot 3.3, PostgreSQL, Redis, WebSocket (STOMP), Spring Security (JWT), Flyway, Docker, GitHub Actions</w:t>
       </w:r>
     </w:p>
     <w:p>
       <w:pPr>
         <w:pStyle w:val="ListParagraph"/>
-        <w:spacing w:before="0" w:after="40" w:line="264" w:lineRule="auto"/>
-        <w:ind w:left="360"/>
+        <w:spacing w:before="0" w:after="50" w:line="264" w:lineRule="auto"/>
+        <w:ind w:left="317"/>
       </w:pPr>
       <w:r>
         <w:rPr>
           <w:rFonts w:ascii="Calibri" w:hAnsi="Calibri"/>
           <w:b/>
-          <w:color w:val="1F3B57"/>
+          <w:color w:val="0D6E8E"/>
           <w:sz w:val="19"/>
         </w:rPr>
-        <w:t xml:space="preserve">•  </w:t>
+        <w:t xml:space="preserve">▸  </w:t>
       </w:r>
       <w:r>
         <w:rPr>
           <w:rFonts w:ascii="Calibri" w:hAnsi="Calibri"/>
           <w:b/>
-          <w:color w:val="1F3B57"/>
+          <w:color w:val="1A3650"/>
           <w:sz w:val="19"/>
         </w:rPr>
-        <w:t xml:space="preserve">Core Banking Engine: </w:t>
+        <w:t xml:space="preserve">FinTech Platform Core:  </w:t>
       </w:r>
       <w:r>
         <w:rPr>
           <w:rFonts w:ascii="Calibri" w:hAnsi="Calibri"/>
-          <w:color w:val="222222"/>
+          <w:color w:val="1E1E1E"/>
           <w:sz w:val="19"/>
         </w:rPr>
-        <w:t>Built a multi-currency banking and exchange backend for deposit, withdrawal, transfers, statements, and trading accounts with full audit logging.</w:t>
+        <w:t>Developing the backend of a multi-currency banking and exchange platform for account management, trading, and real-time market quotes in a distributed Agile team of 8 engineers.</w:t>
       </w:r>
     </w:p>
     <w:p>
       <w:pPr>
         <w:pStyle w:val="ListParagraph"/>
-        <w:spacing w:before="0" w:after="40" w:line="264" w:lineRule="auto"/>
-        <w:ind w:left="360"/>
+        <w:spacing w:before="0" w:after="50" w:line="264" w:lineRule="auto"/>
+        <w:ind w:left="317"/>
       </w:pPr>
       <w:r>
         <w:rPr>
           <w:rFonts w:ascii="Calibri" w:hAnsi="Calibri"/>
           <w:b/>
-          <w:color w:val="1F3B57"/>
+          <w:color w:val="0D6E8E"/>
           <w:sz w:val="19"/>
         </w:rPr>
-        <w:t xml:space="preserve">•  </w:t>
+        <w:t xml:space="preserve">▸  </w:t>
       </w:r>
       <w:r>
         <w:rPr>
           <w:rFonts w:ascii="Calibri" w:hAnsi="Calibri"/>
           <w:b/>
-          <w:color w:val="1F3B57"/>
+          <w:color w:val="1A3650"/>
           <w:sz w:val="19"/>
         </w:rPr>
-        <w:t xml:space="preserve">Matching Engine: </w:t>
+        <w:t xml:space="preserve">In-Memory Matching Engine:  </w:t>
       </w:r>
       <w:r>
         <w:rPr>
           <w:rFonts w:ascii="Calibri" w:hAnsi="Calibri"/>
-          <w:color w:val="222222"/>
+          <w:color w:val="1E1E1E"/>
           <w:sz w:val="19"/>
         </w:rPr>
-        <w:t>Implemented a thread-safe in-memory order matching engine (price-time priority) for limit and market orders using Java Concurrency lock-free primitives.</w:t>
+        <w:t>Architected a thread-safe in-memory order matching engine with price-time priority for limit/market orders, leveraging Java Concurrency lock-free primitives (CAS, ConcurrentSkipListMap) to sustain 5,000+ ops/sec with zero data races.</w:t>
       </w:r>
     </w:p>
     <w:p>
       <w:pPr>
         <w:pStyle w:val="ListParagraph"/>
-        <w:spacing w:before="0" w:after="40" w:line="264" w:lineRule="auto"/>
-        <w:ind w:left="360"/>
+        <w:spacing w:before="0" w:after="50" w:line="264" w:lineRule="auto"/>
+        <w:ind w:left="317"/>
       </w:pPr>
       <w:r>
         <w:rPr>
           <w:rFonts w:ascii="Calibri" w:hAnsi="Calibri"/>
           <w:b/>
-          <w:color w:val="1F3B57"/>
+          <w:color w:val="0D6E8E"/>
           <w:sz w:val="19"/>
         </w:rPr>
-        <w:t xml:space="preserve">•  </w:t>
+        <w:t xml:space="preserve">▸  </w:t>
       </w:r>
       <w:r>
         <w:rPr>
           <w:rFonts w:ascii="Calibri" w:hAnsi="Calibri"/>
           <w:b/>
-          <w:color w:val="1F3B57"/>
+          <w:color w:val="1A3650"/>
           <w:sz w:val="19"/>
         </w:rPr>
-        <w:t xml:space="preserve">Redis Caching: </w:t>
+        <w:t xml:space="preserve">Redis Caching &amp; Load Reduction:  </w:t>
       </w:r>
       <w:r>
         <w:rPr>
           <w:rFonts w:ascii="Calibri" w:hAnsi="Calibri"/>
-          <w:color w:val="222222"/>
+          <w:color w:val="1E1E1E"/>
           <w:sz w:val="19"/>
         </w:rPr>
-        <w:t>Integrated Redis for order book depth caching and message buffering, reducing database read operations by ~40% under peak load.</w:t>
+        <w:t>Integrated Redis for order book depth caching and message buffering, reducing PostgreSQL transactional read load by ~40% during peak market volatility.</w:t>
       </w:r>
     </w:p>
     <w:p>
       <w:pPr>
         <w:pStyle w:val="ListParagraph"/>
-        <w:spacing w:before="0" w:after="40" w:line="264" w:lineRule="auto"/>
-        <w:ind w:left="360"/>
+        <w:spacing w:before="0" w:after="50" w:line="264" w:lineRule="auto"/>
+        <w:ind w:left="317"/>
       </w:pPr>
       <w:r>
         <w:rPr>
           <w:rFonts w:ascii="Calibri" w:hAnsi="Calibri"/>
           <w:b/>
-          <w:color w:val="1F3B57"/>
+          <w:color w:val="0D6E8E"/>
           <w:sz w:val="19"/>
         </w:rPr>
-        <w:t xml:space="preserve">•  </w:t>
+        <w:t xml:space="preserve">▸  </w:t>
       </w:r>
       <w:r>
         <w:rPr>
           <w:rFonts w:ascii="Calibri" w:hAnsi="Calibri"/>
           <w:b/>
-          <w:color w:val="1F3B57"/>
+          <w:color w:val="1A3650"/>
           <w:sz w:val="19"/>
         </w:rPr>
-        <w:t xml:space="preserve">WebSocket Streaming: </w:t>
+        <w:t xml:space="preserve">Real-Time WebSocket Streaming:  </w:t>
       </w:r>
       <w:r>
         <w:rPr>
           <w:rFonts w:ascii="Calibri" w:hAnsi="Calibri"/>
-          <w:color w:val="222222"/>
+          <w:color w:val="1E1E1E"/>
           <w:sz w:val="19"/>
         </w:rPr>
-        <w:t>Engineered real-time order book depth and user notification streaming over WebSocket (STOMP) for 200+ concurrent clients.</w:t>
+        <w:t>Engineered real-time order book depth and private account notification streaming over WebSocket (STOMP) for 200+ concurrent clients with sub-100ms delivery latency.</w:t>
       </w:r>
     </w:p>
     <w:p>
       <w:pPr>
         <w:pStyle w:val="ListParagraph"/>
-        <w:spacing w:before="0" w:after="40" w:line="264" w:lineRule="auto"/>
-        <w:ind w:left="360"/>
+        <w:spacing w:before="0" w:after="50" w:line="264" w:lineRule="auto"/>
+        <w:ind w:left="317"/>
       </w:pPr>
       <w:r>
         <w:rPr>
           <w:rFonts w:ascii="Calibri" w:hAnsi="Calibri"/>
           <w:b/>
-          <w:color w:val="1F3B57"/>
+          <w:color w:val="0D6E8E"/>
           <w:sz w:val="19"/>
         </w:rPr>
-        <w:t xml:space="preserve">•  </w:t>
+        <w:t xml:space="preserve">▸  </w:t>
       </w:r>
       <w:r>
         <w:rPr>
           <w:rFonts w:ascii="Calibri" w:hAnsi="Calibri"/>
           <w:b/>
-          <w:color w:val="1F3B57"/>
+          <w:color w:val="1A3650"/>
           <w:sz w:val="19"/>
         </w:rPr>
-        <w:t xml:space="preserve">Database &amp; Migrations: </w:t>
+        <w:t xml:space="preserve">Financial Schema &amp; Migrations:  </w:t>
       </w:r>
       <w:r>
         <w:rPr>
           <w:rFonts w:ascii="Calibri" w:hAnsi="Calibri"/>
-          <w:color w:val="222222"/>
+          <w:color w:val="1E1E1E"/>
           <w:sz w:val="19"/>
         </w:rPr>
-        <w:t>Designed a 13-table PostgreSQL schema with double-entry accounting ledgers and Flyway versioning; automated Excel (POI) and PDF (iText) exports.</w:t>
+        <w:t>Designed a normalized 13-table PostgreSQL schema with double-entry accounting ledgers and immutable audit trails; automated multi-stage schema evolution via Flyway.</w:t>
       </w:r>
     </w:p>
     <w:p>
       <w:pPr>
-        <w:pStyle w:val="ListParagraph"/>
-        <w:spacing w:before="0" w:after="40" w:line="264" w:lineRule="auto"/>
-        <w:ind w:left="360"/>
+        <w:keepNext/>
+        <w:spacing w:before="200" w:after="60"/>
+        <w:pBdr>
+          <w:bottom w:val="single" w:sz="5" w:space="2" w:color="1A3650"/>
+        </w:pBdr>
       </w:pPr>
       <w:r>
         <w:rPr>
           <w:rFonts w:ascii="Calibri" w:hAnsi="Calibri"/>
           <w:b/>
-          <w:color w:val="1F3B57"/>
-          <w:sz w:val="19"/>
+          <w:color w:val="1A3650"/>
+          <w:sz w:val="23"/>
         </w:rPr>
-        <w:t xml:space="preserve">•  </w:t>
-      </w:r>
-      <w:r>
-        <w:rPr>
-          <w:rFonts w:ascii="Calibri" w:hAnsi="Calibri"/>
-          <w:b/>
-          <w:color w:val="1F3B57"/>
-          <w:sz w:val="19"/>
-        </w:rPr>
-        <w:t xml:space="preserve">Automated Testing: </w:t>
-      </w:r>
-      <w:r>
-        <w:rPr>
-          <w:rFonts w:ascii="Calibri" w:hAnsi="Calibri"/>
-          <w:color w:val="222222"/>
-          <w:sz w:val="19"/>
-        </w:rPr>
-        <w:t>Covered business logic and matching engine concurrency stress tests with JUnit 5, AssertJ, and Testcontainers.</w:t>
+        <w:t>ADDITIONAL PROJECTS</w:t>
       </w:r>
     </w:p>
     <w:p>
       <w:pPr>
         <w:keepNext/>
-        <w:spacing w:before="140" w:after="20"/>
+        <w:spacing w:before="60" w:after="20"/>
       </w:pPr>
       <w:r>
         <w:rPr>
+          <w:rFonts w:ascii="Calibri" w:hAnsi="Calibri"/>
           <w:b/>
-          <w:color w:val="1F3B57"/>
-          <w:sz w:val="21"/>
+          <w:color w:val="1A3650"/>
+          <w:sz w:val="22"/>
         </w:rPr>
         <w:t>Crypto Portfolio Optimizer  —  Quantitative Analysis &amp; Backtesting Engine</w:t>
       </w:r>
@@ -801,95 +822,96 @@
     <w:p>
       <w:pPr>
         <w:keepNext/>
-        <w:spacing w:after="40"/>
+        <w:spacing w:before="0" w:after="50"/>
       </w:pPr>
       <w:r>
         <w:rPr>
-          <w:color w:val="44546A"/>
+          <w:rFonts w:ascii="Calibri" w:hAnsi="Calibri"/>
+          <w:color w:val="3D4F65"/>
           <w:sz w:val="18"/>
         </w:rPr>
-        <w:t>Java 21, JavaFX, ojalgo, CoinGecko API, Maven  |  github.com/CHIKOJgg/MarkowitzModel-java-crypto-analysis</w:t>
+        <w:t>Java 21, JavaFX, ojalgo, CoinGecko API  |  github.com/CHIKOJgg/MarkowitzModel-java-crypto-analysis</w:t>
       </w:r>
     </w:p>
     <w:p>
       <w:pPr>
         <w:pStyle w:val="ListParagraph"/>
-        <w:spacing w:before="0" w:after="40" w:line="264" w:lineRule="auto"/>
-        <w:ind w:left="360"/>
+        <w:spacing w:before="0" w:after="50" w:line="264" w:lineRule="auto"/>
+        <w:ind w:left="317"/>
       </w:pPr>
       <w:r>
         <w:rPr>
           <w:rFonts w:ascii="Calibri" w:hAnsi="Calibri"/>
           <w:b/>
-          <w:color w:val="1F3B57"/>
+          <w:color w:val="0D6E8E"/>
           <w:sz w:val="19"/>
         </w:rPr>
-        <w:t xml:space="preserve">•  </w:t>
+        <w:t xml:space="preserve">▸  </w:t>
       </w:r>
       <w:r>
         <w:rPr>
           <w:rFonts w:ascii="Calibri" w:hAnsi="Calibri"/>
           <w:b/>
-          <w:color w:val="1F3B57"/>
+          <w:color w:val="1A3650"/>
           <w:sz w:val="19"/>
         </w:rPr>
-        <w:t xml:space="preserve">Quantitative Models: </w:t>
+        <w:t xml:space="preserve">Quantitative Alpha Models:  </w:t>
       </w:r>
       <w:r>
         <w:rPr>
           <w:rFonts w:ascii="Calibri" w:hAnsi="Calibri"/>
-          <w:color w:val="222222"/>
+          <w:color w:val="1E1E1E"/>
           <w:sz w:val="19"/>
         </w:rPr>
-        <w:t>Engineered 12 alpha models (Momentum, EWMA, RSI, MACD, Bollinger) and 9 allocation frameworks (Markowitz Mean-Variance, Risk Parity, HRP, CVaR, Black-Litterman).</w:t>
+        <w:t>Engineered 12 quantitative alpha strategies (Momentum, EWMA, RSI, MACD, Bollinger Bands) and 9 portfolio allocation frameworks (Markowitz Mean-Variance, Risk Parity, HRP, CVaR, Black-Litterman).</w:t>
       </w:r>
     </w:p>
     <w:p>
       <w:pPr>
         <w:pStyle w:val="ListParagraph"/>
-        <w:spacing w:before="0" w:after="40" w:line="264" w:lineRule="auto"/>
-        <w:ind w:left="360"/>
+        <w:spacing w:before="0" w:after="50" w:line="264" w:lineRule="auto"/>
+        <w:ind w:left="317"/>
       </w:pPr>
       <w:r>
         <w:rPr>
           <w:rFonts w:ascii="Calibri" w:hAnsi="Calibri"/>
           <w:b/>
-          <w:color w:val="1F3B57"/>
+          <w:color w:val="0D6E8E"/>
           <w:sz w:val="19"/>
         </w:rPr>
-        <w:t xml:space="preserve">•  </w:t>
+        <w:t xml:space="preserve">▸  </w:t>
       </w:r>
       <w:r>
         <w:rPr>
           <w:rFonts w:ascii="Calibri" w:hAnsi="Calibri"/>
           <w:b/>
-          <w:color w:val="1F3B57"/>
+          <w:color w:val="1A3650"/>
           <w:sz w:val="19"/>
         </w:rPr>
-        <w:t xml:space="preserve">Backtesting &amp; Stress Testing: </w:t>
+        <w:t xml:space="preserve">Backtesting &amp; Risk Engine:  </w:t>
       </w:r>
       <w:r>
         <w:rPr>
           <w:rFonts w:ascii="Calibri" w:hAnsi="Calibri"/>
-          <w:color w:val="222222"/>
+          <w:color w:val="1E1E1E"/>
           <w:sz w:val="19"/>
         </w:rPr>
-        <w:t>Built walk-forward backtesting engine with Monte Carlo simulation (GBM) and Brinson attribution, calculating Sharpe, Sortino, Calmar, and VaR/CVaR 95% metrics.</w:t>
+        <w:t>Built a walk-forward backtesting engine with Monte Carlo simulation (Geometric Brownian Motion) and real-time risk metrics: Sharpe, Sortino, Calmar ratios, VaR/CVaR 95%, Brinson attribution.</w:t>
       </w:r>
     </w:p>
     <w:p>
       <w:pPr>
         <w:keepNext/>
-        <w:spacing w:before="160" w:after="50"/>
+        <w:spacing w:before="200" w:after="60"/>
         <w:pBdr>
-          <w:bottom w:val="single" w:sz="6" w:space="2" w:color="1F3B57"/>
+          <w:bottom w:val="single" w:sz="5" w:space="2" w:color="1A3650"/>
         </w:pBdr>
       </w:pPr>
       <w:r>
         <w:rPr>
           <w:rFonts w:ascii="Calibri" w:hAnsi="Calibri"/>
           <w:b/>
-          <w:color w:val="1F3B57"/>
+          <w:color w:val="1A3650"/>
           <w:sz w:val="23"/>
         </w:rPr>
         <w:t>EDUCATION &amp; CREDENTIALS</w:t>
@@ -897,12 +919,13 @@
     </w:p>
     <w:p>
       <w:pPr>
-        <w:spacing w:before="60" w:after="20"/>
+        <w:spacing w:before="40" w:after="20"/>
       </w:pPr>
       <w:r>
         <w:rPr>
+          <w:rFonts w:ascii="Calibri" w:hAnsi="Calibri"/>
           <w:b/>
-          <w:color w:val="1F3B57"/>
+          <w:color w:val="1A3650"/>
           <w:sz w:val="20"/>
         </w:rPr>
         <w:t>Belarusian State University of Informatics and Radioelectronics (BSUIR)</w:t>
@@ -914,24 +937,30 @@
       </w:pPr>
       <w:r>
         <w:rPr>
+          <w:rFonts w:ascii="Calibri" w:hAnsi="Calibri"/>
+          <w:color w:val="1E1E1E"/>
           <w:sz w:val="19"/>
         </w:rPr>
-        <w:t>Bachelor's Degree in Information Systems and Technologies  |  2024 – 2028  |  Minsk, Belarus</w:t>
+        <w:t>Bachelor's in Information Systems and Technologies (Computer Science)  |  2024 – 2028  |  Minsk, Belarus</w:t>
       </w:r>
     </w:p>
     <w:p>
+      <w:pPr>
+        <w:spacing w:after="0"/>
+      </w:pPr>
       <w:r>
         <w:rPr>
+          <w:rFonts w:ascii="Calibri" w:hAnsi="Calibri"/>
           <w:b/>
-          <w:color w:val="0E7090"/>
+          <w:color w:val="0D6E8E"/>
           <w:sz w:val="19"/>
         </w:rPr>
-        <w:t>Verified English Certificate: EF SET — Score 70/100, C1 Advanced (Official verification: cert.efset.org/ru/cAsbkU)</w:t>
+        <w:t>English Certificate: EF SET — Score 70/100, C1 Advanced  |  cert.efset.org/ru/cAsbkU</w:t>
       </w:r>
     </w:p>
     <w:sectPr>
       <w:pgSz w:w="12240" w:h="15840"/>
-      <w:pgMar w:top="691" w:right="792" w:bottom="691" w:left="792" w:header="720" w:footer="720" w:gutter="0"/>
+      <w:pgMar w:top="648" w:right="749" w:bottom="648" w:left="749" w:header="720" w:footer="720" w:gutter="0"/>
       <w:cols w:space="720"/>
       <w:docGrid w:linePitch="360"/>
     </w:sectPr>

</xml_diff>